<commit_message>
[T06] fix(docs): actualizar enlaces del repositorio y tablero Kanban en documentos de Seguimiento 1 y README
</commit_message>
<xml_diff>
--- a/00_Gestion/Plan_de_Gestion_Iniciativa_TutorU_Semana4_IF2008.docx
+++ b/00_Gestion/Plan_de_Gestion_Iniciativa_TutorU_Semana4_IF2008.docx
@@ -2435,22 +2435,16 @@
           </w:tcPr>
           <w:p>
             <w:pPr>
-              <w:pBdr>
-                <w:top w:val="nil"/>
-                <w:left w:val="nil"/>
-                <w:bottom w:val="nil"/>
-                <w:right w:val="nil"/>
-                <w:between w:val="nil"/>
-              </w:pBdr>
-            </w:pPr>
-            <w:r>
-              <w:t>github.com/org/</w:t>
-            </w:r>
-            <w:proofErr w:type="spellStart"/>
-            <w:r>
-              <w:t>tutoru</w:t>
-            </w:r>
-            <w:proofErr w:type="spellEnd"/>
+              <w:spacing w:before="20" w:after="20" w:line="252" w:lineRule="auto"/>
+            </w:pPr>
+            <w:r/>
+            <w:r>
+              <w:rPr>
+                <w:rFonts w:ascii="Calibri" w:hAnsi="Calibri"/>
+                <w:sz w:val="17"/>
+              </w:rPr>
+              <w:t>https://github.com/Blasterjax/TutorU-Project</w:t>
+            </w:r>
           </w:p>
         </w:tc>
       </w:tr>
@@ -2656,25 +2650,15 @@
           </w:tcPr>
           <w:p>
             <w:pPr>
-              <w:pBdr>
-                <w:top w:val="nil"/>
-                <w:left w:val="nil"/>
-                <w:bottom w:val="nil"/>
-                <w:right w:val="nil"/>
-                <w:between w:val="nil"/>
-              </w:pBdr>
-            </w:pPr>
-            <w:r>
-              <w:lastRenderedPageBreak/>
-              <w:t>github.com/org/</w:t>
-            </w:r>
-            <w:proofErr w:type="spellStart"/>
-            <w:r>
-              <w:t>tutoru</w:t>
-            </w:r>
-            <w:proofErr w:type="spellEnd"/>
-            <w:r>
-              <w:t>/projects/1</w:t>
+              <w:spacing w:before="20" w:after="20" w:line="252" w:lineRule="auto"/>
+            </w:pPr>
+            <w:r/>
+            <w:r>
+              <w:rPr>
+                <w:rFonts w:ascii="Calibri" w:hAnsi="Calibri"/>
+                <w:sz w:val="17"/>
+              </w:rPr>
+              <w:t>https://github.com/users/Blasterjax/projects/1</w:t>
             </w:r>
           </w:p>
         </w:tc>
@@ -14305,8 +14289,17 @@
               <w:rPr>
                 <w:lang w:val="es-CO"/>
               </w:rPr>
-              <w:t>GitHub (público / institucional accesible al docente): https://github.com/TutorU-IUE/TutorU-Project</w:t>
-            </w:r>
+              <w:t xml:space="preserve">GitHub (público / institucional accesible al docente): </w:t>
+            </w:r>
+            <w:hyperlink r:id="rId5" w:history="1">
+              <w:r>
+                <w:rPr>
+                  <w:rStyle w:val="Hyperlink"/>
+                  <w:lang w:val="es-CO"/>
+                </w:rPr>
+                <w:t>https://github.com/Blasterjax/TutorU-Project</w:t>
+              </w:r>
+            </w:hyperlink>
           </w:p>
         </w:tc>
       </w:tr>
@@ -16182,8 +16175,16 @@
             </w:r>
             <w:proofErr w:type="spellEnd"/>
             <w:r>
-              <w:t>): https://github.com/orgs/TutorU-IUE/projects/1</w:t>
-            </w:r>
+              <w:t xml:space="preserve">): </w:t>
+            </w:r>
+            <w:hyperlink r:id="rId6" w:history="1">
+              <w:r>
+                <w:rPr>
+                  <w:rStyle w:val="Hyperlink"/>
+                </w:rPr>
+                <w:t>https://github.com/users/Blasterjax/projects/1</w:t>
+              </w:r>
+            </w:hyperlink>
           </w:p>
         </w:tc>
       </w:tr>
@@ -21344,7 +21345,7 @@
               <w:rPr>
                 <w:lang w:val="es-CO"/>
               </w:rPr>
-              <w:t>https://github.com/TutorU-IUE/TutorU-Project</w:t>
+              <w:t>https://github.com/Blasterjax/TutorU-Project</w:t>
             </w:r>
           </w:p>
         </w:tc>
@@ -21485,7 +21486,7 @@
               <w:rPr>
                 <w:lang w:val="es-CO"/>
               </w:rPr>
-              <w:t>https://github.com/orgs/TutorU-IUE/projects/1</w:t>
+              <w:t>https://github.com/users/Blasterjax/projects/1</w:t>
             </w:r>
           </w:p>
         </w:tc>
@@ -23121,6 +23122,29 @@
       <w:tblStyleColBandSize w:val="1"/>
     </w:tblPr>
   </w:style>
+  <w:style w:type="character" w:styleId="Hyperlink">
+    <w:name w:val="Hyperlink"/>
+    <w:basedOn w:val="DefaultParagraphFont"/>
+    <w:uiPriority w:val="99"/>
+    <w:unhideWhenUsed/>
+    <w:rsid w:val="005758BB"/>
+    <w:rPr>
+      <w:color w:val="0000FF" w:themeColor="hyperlink"/>
+      <w:u w:val="single"/>
+    </w:rPr>
+  </w:style>
+  <w:style w:type="character" w:styleId="UnresolvedMention">
+    <w:name w:val="Unresolved Mention"/>
+    <w:basedOn w:val="DefaultParagraphFont"/>
+    <w:uiPriority w:val="99"/>
+    <w:semiHidden/>
+    <w:unhideWhenUsed/>
+    <w:rsid w:val="005758BB"/>
+    <w:rPr>
+      <w:color w:val="605E5C"/>
+      <w:shd w:val="clear" w:color="auto" w:fill="E1DFDD"/>
+    </w:rPr>
+  </w:style>
 </w:styles>
 </file>
 

</xml_diff>